<commit_message>
feat: implement document ownership and access control scoping for digital archive
</commit_message>
<xml_diff>
--- a/src/resources/templates/kepegawaian/surat-tugas.docx
+++ b/src/resources/templates/kepegawaian/surat-tugas.docx
@@ -285,6 +285,12 @@
       <w:pPr>
         <w:spacing w:after="100" w:line="240" w:lineRule="auto"/>
         <w:jc w:val="center"/>
+      </w:pPr>
+    </w:p>
+    <w:p>
+      <w:pPr>
+        <w:spacing w:after="100" w:line="240" w:lineRule="auto"/>
+        <w:jc w:val="center"/>
         <w:rPr>
           <w:rFonts w:ascii="Bookman Old Style" w:hAnsi="Bookman Old Style"/>
           <w:sz w:val="24"/>
@@ -737,16 +743,12 @@
           </w:tcPr>
           <w:p>
             <w:pPr>
-              <w:tabs>
-                <w:tab w:val="left" w:pos="1450"/>
-              </w:tabs>
               <w:spacing w:line="276" w:lineRule="auto"/>
               <w:jc w:val="both"/>
               <w:rPr>
                 <w:rFonts w:ascii="Bookman Old Style" w:hAnsi="Bookman Old Style"/>
                 <w:sz w:val="24"/>
                 <w:szCs w:val="24"/>
-                <w:lang w:val="fi-FI"/>
               </w:rPr>
             </w:pPr>
           </w:p>
@@ -763,7 +765,6 @@
                 <w:rFonts w:ascii="Bookman Old Style" w:hAnsi="Bookman Old Style"/>
                 <w:sz w:val="24"/>
                 <w:szCs w:val="24"/>
-                <w:lang w:val="fi-FI"/>
               </w:rPr>
             </w:pPr>
           </w:p>
@@ -784,55 +785,7 @@
               <w:rPr>
                 <w:rFonts w:ascii="Bookman Old Style" w:hAnsi="Bookman Old Style"/>
               </w:rPr>
-              <w:t xml:space="preserve">hari, tanggal </w:t>
-            </w:r>
-          </w:p>
-          <w:p>
-            <w:pPr>
-              <w:spacing w:line="276" w:lineRule="auto"/>
-              <w:jc w:val="both"/>
-              <w:rPr>
-                <w:rFonts w:ascii="Bookman Old Style" w:hAnsi="Bookman Old Style"/>
-              </w:rPr>
-            </w:pPr>
-            <w:r>
-              <w:rPr>
-                <w:rFonts w:ascii="Bookman Old Style" w:hAnsi="Bookman Old Style"/>
-              </w:rPr>
-              <w:t>waktu</w:t>
-            </w:r>
-            <w:r>
-              <w:rPr>
-                <w:rFonts w:ascii="Bookman Old Style" w:hAnsi="Bookman Old Style"/>
-              </w:rPr>
-              <w:t xml:space="preserve">  </w:t>
-            </w:r>
-          </w:p>
-          <w:p>
-            <w:pPr>
-              <w:spacing w:line="276" w:lineRule="auto"/>
-              <w:jc w:val="both"/>
-              <w:rPr>
-                <w:rFonts w:ascii="Bookman Old Style" w:hAnsi="Bookman Old Style"/>
-              </w:rPr>
-            </w:pPr>
-            <w:r>
-              <w:rPr>
-                <w:rFonts w:ascii="Bookman Old Style" w:hAnsi="Bookman Old Style"/>
-              </w:rPr>
-              <w:t>t</w:t>
-            </w:r>
-            <w:r>
-              <w:rPr>
-                <w:rFonts w:ascii="Bookman Old Style" w:hAnsi="Bookman Old Style"/>
-              </w:rPr>
-              <w:t>empat</w:t>
-            </w:r>
-            <w:r>
-              <w:rPr>
-                <w:rFonts w:ascii="Bookman Old Style" w:hAnsi="Bookman Old Style"/>
-              </w:rPr>
-              <w:t xml:space="preserve">  </w:t>
+              <w:t xml:space="preserve">hari, tanggal</w:t>
             </w:r>
           </w:p>
         </w:tc>
@@ -852,37 +805,7 @@
               <w:rPr>
                 <w:rFonts w:ascii="Bookman Old Style" w:hAnsi="Bookman Old Style"/>
               </w:rPr>
-              <w:t>:</w:t>
-            </w:r>
-          </w:p>
-          <w:p>
-            <w:pPr>
-              <w:spacing w:line="276" w:lineRule="auto"/>
-              <w:jc w:val="both"/>
-              <w:rPr>
-                <w:rFonts w:ascii="Bookman Old Style" w:hAnsi="Bookman Old Style"/>
-              </w:rPr>
-            </w:pPr>
-            <w:r>
-              <w:rPr>
-                <w:rFonts w:ascii="Bookman Old Style" w:hAnsi="Bookman Old Style"/>
-              </w:rPr>
-              <w:t>:</w:t>
-            </w:r>
-          </w:p>
-          <w:p>
-            <w:pPr>
-              <w:spacing w:line="276" w:lineRule="auto"/>
-              <w:jc w:val="both"/>
-              <w:rPr>
-                <w:rFonts w:ascii="Bookman Old Style" w:hAnsi="Bookman Old Style"/>
-              </w:rPr>
-            </w:pPr>
-            <w:r>
-              <w:rPr>
-                <w:rFonts w:ascii="Bookman Old Style" w:hAnsi="Bookman Old Style"/>
-              </w:rPr>
-              <w:t>:</w:t>
+              <w:t xml:space="preserve">:</w:t>
             </w:r>
           </w:p>
         </w:tc>
@@ -903,47 +826,205 @@
               <w:rPr>
                 <w:rFonts w:ascii="Bookman Old Style" w:hAnsi="Bookman Old Style"/>
               </w:rPr>
-              <w:t>${hari_tanggal}</w:t>
-            </w:r>
-          </w:p>
-          <w:p>
-            <w:pPr>
-              <w:spacing w:line="276" w:lineRule="auto"/>
-              <w:jc w:val="both"/>
-              <w:rPr>
-                <w:rFonts w:ascii="Bookman Old Style" w:hAnsi="Bookman Old Style"/>
-              </w:rPr>
-            </w:pPr>
-            <w:r>
-              <w:rPr>
-                <w:rFonts w:ascii="Bookman Old Style" w:hAnsi="Bookman Old Style"/>
-              </w:rPr>
-              <w:t>${waktu}</w:t>
-            </w:r>
-          </w:p>
-          <w:p>
-            <w:pPr>
-              <w:spacing w:line="276" w:lineRule="auto"/>
-              <w:ind w:left="26" w:hanging="141"/>
-              <w:jc w:val="both"/>
-              <w:rPr>
-                <w:rFonts w:ascii="Bookman Old Style" w:hAnsi="Bookman Old Style"/>
-                <w:lang w:val="en-ID"/>
-              </w:rPr>
-            </w:pPr>
-            <w:r>
-              <w:rPr>
-                <w:rFonts w:ascii="Bookman Old Style" w:hAnsi="Bookman Old Style"/>
-                <w:lang w:val="en-ID"/>
-              </w:rPr>
-              <w:t xml:space="preserve">  </w:t>
-            </w:r>
-            <w:r>
-              <w:rPr>
-                <w:rFonts w:ascii="Bookman Old Style" w:hAnsi="Bookman Old Style"/>
-                <w:lang w:val="en-ID"/>
-              </w:rPr>
-              <w:t>${tempat}</w:t>
+              <w:t xml:space="preserve">${hari_tanggal}</w:t>
+            </w:r>
+          </w:p>
+        </w:tc>
+      </w:tr>
+      <w:tr>
+        <w:trPr>
+          <w:gridAfter w:val="1"/>
+          <w:wAfter w:w="103" w:type="dxa"/>
+        </w:trPr>
+        <w:tc>
+          <w:tcPr>
+            <w:tcW w:w="1843" w:type="dxa"/>
+          </w:tcPr>
+          <w:p>
+            <w:pPr>
+              <w:spacing w:line="276" w:lineRule="auto"/>
+              <w:jc w:val="both"/>
+              <w:rPr>
+                <w:rFonts w:ascii="Bookman Old Style" w:hAnsi="Bookman Old Style"/>
+                <w:sz w:val="24"/>
+                <w:szCs w:val="24"/>
+              </w:rPr>
+            </w:pPr>
+          </w:p>
+        </w:tc>
+        <w:tc>
+          <w:tcPr>
+            <w:tcW w:w="442" w:type="dxa"/>
+          </w:tcPr>
+          <w:p>
+            <w:pPr>
+              <w:spacing w:line="276" w:lineRule="auto"/>
+              <w:jc w:val="both"/>
+              <w:rPr>
+                <w:rFonts w:ascii="Bookman Old Style" w:hAnsi="Bookman Old Style"/>
+                <w:sz w:val="24"/>
+                <w:szCs w:val="24"/>
+              </w:rPr>
+            </w:pPr>
+          </w:p>
+        </w:tc>
+        <w:tc>
+          <w:tcPr>
+            <w:tcW w:w="1830" w:type="dxa"/>
+          </w:tcPr>
+          <w:p>
+            <w:pPr>
+              <w:spacing w:line="276" w:lineRule="auto"/>
+              <w:jc w:val="both"/>
+              <w:rPr>
+                <w:rFonts w:ascii="Bookman Old Style" w:hAnsi="Bookman Old Style"/>
+              </w:rPr>
+            </w:pPr>
+            <w:r>
+              <w:rPr>
+                <w:rFonts w:ascii="Bookman Old Style" w:hAnsi="Bookman Old Style"/>
+              </w:rPr>
+              <w:t xml:space="preserve">waktu</w:t>
+            </w:r>
+          </w:p>
+        </w:tc>
+        <w:tc>
+          <w:tcPr>
+            <w:tcW w:w="287" w:type="dxa"/>
+          </w:tcPr>
+          <w:p>
+            <w:pPr>
+              <w:spacing w:line="276" w:lineRule="auto"/>
+              <w:jc w:val="both"/>
+              <w:rPr>
+                <w:rFonts w:ascii="Bookman Old Style" w:hAnsi="Bookman Old Style"/>
+              </w:rPr>
+            </w:pPr>
+            <w:r>
+              <w:rPr>
+                <w:rFonts w:ascii="Bookman Old Style" w:hAnsi="Bookman Old Style"/>
+              </w:rPr>
+              <w:t xml:space="preserve">:</w:t>
+            </w:r>
+          </w:p>
+        </w:tc>
+        <w:tc>
+          <w:tcPr>
+            <w:tcW w:w="4670" w:type="dxa"/>
+            <w:gridSpan w:val="2"/>
+          </w:tcPr>
+          <w:p>
+            <w:pPr>
+              <w:spacing w:line="276" w:lineRule="auto"/>
+              <w:jc w:val="both"/>
+              <w:rPr>
+                <w:rFonts w:ascii="Bookman Old Style" w:hAnsi="Bookman Old Style"/>
+              </w:rPr>
+            </w:pPr>
+            <w:r>
+              <w:rPr>
+                <w:rFonts w:ascii="Bookman Old Style" w:hAnsi="Bookman Old Style"/>
+              </w:rPr>
+              <w:t xml:space="preserve">${waktu}</w:t>
+            </w:r>
+          </w:p>
+        </w:tc>
+      </w:tr>
+      <w:tr>
+        <w:trPr>
+          <w:gridAfter w:val="1"/>
+          <w:wAfter w:w="103" w:type="dxa"/>
+        </w:trPr>
+        <w:tc>
+          <w:tcPr>
+            <w:tcW w:w="1843" w:type="dxa"/>
+          </w:tcPr>
+          <w:p>
+            <w:pPr>
+              <w:spacing w:line="276" w:lineRule="auto"/>
+              <w:jc w:val="both"/>
+              <w:rPr>
+                <w:rFonts w:ascii="Bookman Old Style" w:hAnsi="Bookman Old Style"/>
+                <w:sz w:val="24"/>
+                <w:szCs w:val="24"/>
+              </w:rPr>
+            </w:pPr>
+          </w:p>
+        </w:tc>
+        <w:tc>
+          <w:tcPr>
+            <w:tcW w:w="442" w:type="dxa"/>
+          </w:tcPr>
+          <w:p>
+            <w:pPr>
+              <w:spacing w:line="276" w:lineRule="auto"/>
+              <w:jc w:val="both"/>
+              <w:rPr>
+                <w:rFonts w:ascii="Bookman Old Style" w:hAnsi="Bookman Old Style"/>
+                <w:sz w:val="24"/>
+                <w:szCs w:val="24"/>
+              </w:rPr>
+            </w:pPr>
+          </w:p>
+        </w:tc>
+        <w:tc>
+          <w:tcPr>
+            <w:tcW w:w="1830" w:type="dxa"/>
+          </w:tcPr>
+          <w:p>
+            <w:pPr>
+              <w:spacing w:line="276" w:lineRule="auto"/>
+              <w:jc w:val="both"/>
+              <w:rPr>
+                <w:rFonts w:ascii="Bookman Old Style" w:hAnsi="Bookman Old Style"/>
+              </w:rPr>
+            </w:pPr>
+            <w:r>
+              <w:rPr>
+                <w:rFonts w:ascii="Bookman Old Style" w:hAnsi="Bookman Old Style"/>
+              </w:rPr>
+              <w:t xml:space="preserve">tempat</w:t>
+            </w:r>
+          </w:p>
+        </w:tc>
+        <w:tc>
+          <w:tcPr>
+            <w:tcW w:w="287" w:type="dxa"/>
+          </w:tcPr>
+          <w:p>
+            <w:pPr>
+              <w:spacing w:line="276" w:lineRule="auto"/>
+              <w:jc w:val="both"/>
+              <w:rPr>
+                <w:rFonts w:ascii="Bookman Old Style" w:hAnsi="Bookman Old Style"/>
+              </w:rPr>
+            </w:pPr>
+            <w:r>
+              <w:rPr>
+                <w:rFonts w:ascii="Bookman Old Style" w:hAnsi="Bookman Old Style"/>
+              </w:rPr>
+              <w:t xml:space="preserve">:</w:t>
+            </w:r>
+          </w:p>
+        </w:tc>
+        <w:tc>
+          <w:tcPr>
+            <w:tcW w:w="4670" w:type="dxa"/>
+            <w:gridSpan w:val="2"/>
+          </w:tcPr>
+          <w:p>
+            <w:pPr>
+              <w:spacing w:line="276" w:lineRule="auto"/>
+              <w:jc w:val="both"/>
+              <w:rPr>
+                <w:rFonts w:ascii="Bookman Old Style" w:hAnsi="Bookman Old Style"/>
+              </w:rPr>
+            </w:pPr>
+            <w:r>
+              <w:rPr>
+                <w:rFonts w:ascii="Bookman Old Style" w:hAnsi="Bookman Old Style"/>
+              </w:rPr>
+              <w:t xml:space="preserve">${tempat}</w:t>
             </w:r>
           </w:p>
         </w:tc>
@@ -1554,7 +1635,7 @@
           <w:szCs w:val="24"/>
           <w:lang w:val="id-ID"/>
         </w:rPr>
-        <w:t>${tanggal_naskah_lampiran}</w:t>
+        <w:t>${tanggal_naskah}</w:t>
       </w:r>
     </w:p>
     <w:p>

</xml_diff>